<commit_message>
Aktualisierung der Hinweise inkl Rechtsbehelf
Aktualisierungen in allen Zeugnissen
</commit_message>
<xml_diff>
--- a/Zeugnisse-Sek-1-Versionsgeschichte.docx
+++ b/Zeugnisse-Sek-1-Versionsgeschichte.docx
@@ -74,6 +74,78 @@
           <w:szCs w:val="36"/>
         </w:rPr>
         <w:t>)</w:t>
+      </w:r>
+    </w:p>
+    <w:p>
+      <w:pPr>
+        <w:spacing w:after="0" w:line="240" w:lineRule="auto"/>
+        <w:rPr>
+          <w:b/>
+          <w:bCs/>
+          <w:sz w:val="24"/>
+          <w:szCs w:val="24"/>
+        </w:rPr>
+      </w:pPr>
+    </w:p>
+    <w:p>
+      <w:pPr>
+        <w:spacing w:after="0" w:line="240" w:lineRule="auto"/>
+        <w:rPr>
+          <w:b/>
+          <w:bCs/>
+          <w:sz w:val="24"/>
+          <w:szCs w:val="24"/>
+        </w:rPr>
+      </w:pPr>
+      <w:r>
+        <w:rPr>
+          <w:b/>
+          <w:bCs/>
+          <w:sz w:val="24"/>
+          <w:szCs w:val="24"/>
+        </w:rPr>
+        <w:t>12.10.2026</w:t>
+      </w:r>
+    </w:p>
+    <w:p>
+      <w:pPr>
+        <w:spacing w:after="0" w:line="240" w:lineRule="auto"/>
+        <w:rPr>
+          <w:bCs/>
+          <w:sz w:val="24"/>
+          <w:szCs w:val="24"/>
+        </w:rPr>
+      </w:pPr>
+      <w:r>
+        <w:rPr>
+          <w:bCs/>
+          <w:sz w:val="24"/>
+          <w:szCs w:val="24"/>
+        </w:rPr>
+        <w:t>Alle Schulformen Sek 1, alle Zeugnisse</w:t>
+      </w:r>
+    </w:p>
+    <w:p>
+      <w:pPr>
+        <w:pStyle w:val="Listenabsatz"/>
+        <w:numPr>
+          <w:ilvl w:val="0"/>
+          <w:numId w:val="25"/>
+        </w:numPr>
+        <w:spacing w:after="0" w:line="240" w:lineRule="auto"/>
+        <w:rPr>
+          <w:bCs/>
+          <w:sz w:val="24"/>
+          <w:szCs w:val="24"/>
+        </w:rPr>
+      </w:pPr>
+      <w:r>
+        <w:rPr>
+          <w:bCs/>
+          <w:sz w:val="24"/>
+          <w:szCs w:val="24"/>
+        </w:rPr>
+        <w:t>Die Hinweistexte am Ende des Zeugnisses inklusive der Rechtsbehelfsbelehrung wurden aktualisiert.</w:t>
       </w:r>
     </w:p>
     <w:p>
@@ -691,6 +763,7 @@
           <w:sz w:val="24"/>
           <w:szCs w:val="24"/>
         </w:rPr>
+        <w:lastRenderedPageBreak/>
         <w:t>03.02.2025</w:t>
       </w:r>
     </w:p>
@@ -787,7 +860,6 @@
           <w:sz w:val="24"/>
           <w:szCs w:val="24"/>
         </w:rPr>
-        <w:lastRenderedPageBreak/>
         <w:t>14.01.2025</w:t>
       </w:r>
     </w:p>
@@ -1539,6 +1611,7 @@
           <w:sz w:val="24"/>
           <w:szCs w:val="24"/>
         </w:rPr>
+        <w:lastRenderedPageBreak/>
         <w:t>22.12.2023</w:t>
       </w:r>
     </w:p>
@@ -1597,7 +1670,6 @@
           <w:sz w:val="24"/>
           <w:szCs w:val="24"/>
         </w:rPr>
-        <w:lastRenderedPageBreak/>
         <w:t>Hinweis: Die Nutzung der Ankreuzkompetenzen für den Wahlpflichtbereich ist erst ab der SchILD Version 2.0.32.4 möglich.</w:t>
       </w:r>
     </w:p>
@@ -2122,6 +2194,7 @@
           <w:sz w:val="24"/>
           <w:szCs w:val="24"/>
         </w:rPr>
+        <w:lastRenderedPageBreak/>
         <w:t>SK-Anlagen 46, 48 und 49, 50:</w:t>
       </w:r>
       <w:r>
@@ -2204,7 +2277,6 @@
           <w:sz w:val="24"/>
           <w:szCs w:val="24"/>
         </w:rPr>
-        <w:lastRenderedPageBreak/>
         <w:t>Bei Personen mit den Geschlechtseinträgen „divers“ und „ohne Angabe“ werden nun geschlechtsneutrale Formulierungen benutzt.</w:t>
       </w:r>
     </w:p>
@@ -2731,6 +2803,7 @@
           <w:sz w:val="24"/>
           <w:szCs w:val="24"/>
         </w:rPr>
+        <w:lastRenderedPageBreak/>
         <w:t xml:space="preserve">HS-Anlage 15 (Abgangszeugnis): </w:t>
       </w:r>
       <w:r>
@@ -2796,7 +2869,6 @@
           <w:sz w:val="24"/>
           <w:szCs w:val="24"/>
         </w:rPr>
-        <w:lastRenderedPageBreak/>
         <w:t xml:space="preserve">SK-Anlage 46 (Zeugnis 05-06): </w:t>
       </w:r>
       <w:r>
@@ -3374,6 +3446,7 @@
           <w:szCs w:val="24"/>
           <w:lang w:eastAsia="de-DE"/>
         </w:rPr>
+        <w:lastRenderedPageBreak/>
         <w:t>an neue Vorlage angepasst</w:t>
       </w:r>
       <w:r>
@@ -3620,7 +3693,6 @@
           <w:szCs w:val="24"/>
           <w:lang w:eastAsia="de-DE"/>
         </w:rPr>
-        <w:lastRenderedPageBreak/>
         <w:t>einheitlich in allen Überweisungs-, Abgangs- und Abschlusszeugnissen für alle Fächer "UeZeugnisbezeichnung" ausgewählt</w:t>
       </w:r>
     </w:p>
@@ -3970,6 +4042,7 @@
           <w:sz w:val="24"/>
           <w:szCs w:val="24"/>
         </w:rPr>
+        <w:lastRenderedPageBreak/>
         <w:t>Wenn beim Schüler im akt. Abschnitt ein individueller Versetzungsvermerk eingetragen wird, dann wird dieser und nicht der Standardtext gedruckt.</w:t>
       </w:r>
     </w:p>
@@ -4032,410 +4105,410 @@
           <w:sz w:val="24"/>
           <w:szCs w:val="24"/>
         </w:rPr>
+        <w:t>Es kann nun über die INI-Datei eingestellt werden, ab das Feld Vorname, die Felder Vorname + Zusatz oder nur das Feld Zusatz (Alle Vornamen) ausgewertet wird.</w:t>
+      </w:r>
+    </w:p>
+    <w:p>
+      <w:pPr>
+        <w:rPr>
+          <w:sz w:val="24"/>
+          <w:szCs w:val="24"/>
+        </w:rPr>
+      </w:pPr>
+      <w:r>
+        <w:rPr>
+          <w:sz w:val="24"/>
+          <w:szCs w:val="24"/>
+        </w:rPr>
+        <w:t>Alle Änderungen sind im PDF Hinweise zur Nutzung beschrieben.</w:t>
+      </w:r>
+    </w:p>
+    <w:p>
+      <w:pPr>
+        <w:rPr>
+          <w:b/>
+          <w:bCs/>
+          <w:sz w:val="24"/>
+          <w:szCs w:val="24"/>
+        </w:rPr>
+      </w:pPr>
+    </w:p>
+    <w:p>
+      <w:pPr>
+        <w:rPr>
+          <w:b/>
+          <w:bCs/>
+          <w:sz w:val="24"/>
+          <w:szCs w:val="24"/>
+        </w:rPr>
+      </w:pPr>
+      <w:r>
+        <w:rPr>
+          <w:b/>
+          <w:bCs/>
+          <w:sz w:val="24"/>
+          <w:szCs w:val="24"/>
+        </w:rPr>
+        <w:t>31</w:t>
+      </w:r>
+      <w:r>
+        <w:rPr>
+          <w:b/>
+          <w:bCs/>
+          <w:sz w:val="24"/>
+          <w:szCs w:val="24"/>
+        </w:rPr>
+        <w:t>.01.2020</w:t>
+      </w:r>
+    </w:p>
+    <w:p>
+      <w:r>
+        <w:rPr>
+          <w:sz w:val="24"/>
+          <w:szCs w:val="24"/>
+        </w:rPr>
+        <w:t>Im Paket der RS wurde im Überweisungszeugnis die Ausgabe der Schulform im Kopf korrigiert.</w:t>
+      </w:r>
+    </w:p>
+    <w:p>
+      <w:pPr>
+        <w:rPr>
+          <w:b/>
+          <w:bCs/>
+          <w:sz w:val="24"/>
+          <w:szCs w:val="24"/>
+        </w:rPr>
+      </w:pPr>
+      <w:r>
+        <w:rPr>
+          <w:b/>
+          <w:bCs/>
+          <w:sz w:val="24"/>
+          <w:szCs w:val="24"/>
+        </w:rPr>
+        <w:t>29</w:t>
+      </w:r>
+      <w:r>
+        <w:rPr>
+          <w:b/>
+          <w:bCs/>
+          <w:sz w:val="24"/>
+          <w:szCs w:val="24"/>
+        </w:rPr>
+        <w:t>.01.2020</w:t>
+      </w:r>
+    </w:p>
+    <w:p>
+      <w:r>
+        <w:rPr>
+          <w:sz w:val="24"/>
+          <w:szCs w:val="24"/>
+        </w:rPr>
+        <w:t>Im Paket SK wurde in Anlage 46 ein Fehler bei der Anzeige der Elternsprechtage behoben.</w:t>
+      </w:r>
+    </w:p>
+    <w:p>
+      <w:pPr>
+        <w:rPr>
+          <w:b/>
+          <w:bCs/>
+          <w:sz w:val="24"/>
+          <w:szCs w:val="24"/>
+        </w:rPr>
+      </w:pPr>
+      <w:r>
+        <w:rPr>
+          <w:b/>
+          <w:bCs/>
+          <w:sz w:val="24"/>
+          <w:szCs w:val="24"/>
+        </w:rPr>
+        <w:t>20</w:t>
+      </w:r>
+      <w:r>
+        <w:rPr>
+          <w:b/>
+          <w:bCs/>
+          <w:sz w:val="24"/>
+          <w:szCs w:val="24"/>
+        </w:rPr>
+        <w:t>.01.2020</w:t>
+      </w:r>
+    </w:p>
+    <w:p>
+      <w:pPr>
+        <w:rPr>
+          <w:b/>
+          <w:bCs/>
+          <w:sz w:val="24"/>
+          <w:szCs w:val="24"/>
+        </w:rPr>
+      </w:pPr>
+      <w:r>
+        <w:rPr>
+          <w:sz w:val="24"/>
+          <w:szCs w:val="24"/>
+        </w:rPr>
+        <w:t>Im Paket RS Bildungsgang HS wurde ein Tippfehler „Realschuele“ in den Hinweisen zum Zeugnis korrigiert.</w:t>
+      </w:r>
+      <w:r>
+        <w:rPr>
+          <w:sz w:val="24"/>
+          <w:szCs w:val="24"/>
+        </w:rPr>
+        <w:t xml:space="preserve"> Außerdem wurde ein überflüssiges „der“ in der Formulierung zum Förderschwerpunkt entfernt.</w:t>
+      </w:r>
+    </w:p>
+    <w:p>
+      <w:pPr>
+        <w:rPr>
+          <w:b/>
+          <w:bCs/>
+          <w:sz w:val="24"/>
+          <w:szCs w:val="24"/>
+        </w:rPr>
+      </w:pPr>
+      <w:r>
+        <w:rPr>
+          <w:b/>
+          <w:bCs/>
+          <w:sz w:val="24"/>
+          <w:szCs w:val="24"/>
+        </w:rPr>
+        <w:t>20</w:t>
+      </w:r>
+      <w:r>
+        <w:rPr>
+          <w:b/>
+          <w:bCs/>
+          <w:sz w:val="24"/>
+          <w:szCs w:val="24"/>
+        </w:rPr>
+        <w:t>.01.2020</w:t>
+      </w:r>
+    </w:p>
+    <w:p>
+      <w:pPr>
+        <w:rPr>
+          <w:b/>
+          <w:bCs/>
+          <w:sz w:val="24"/>
+          <w:szCs w:val="24"/>
+        </w:rPr>
+      </w:pPr>
+      <w:r>
+        <w:rPr>
+          <w:sz w:val="24"/>
+          <w:szCs w:val="24"/>
+        </w:rPr>
+        <w:t>Im Paket der RS-Zeugnisse wurde ein Fehler bei der Ausgabe des Förderschwerpunkts behoben, es erschien nur „im Bildungsgang“ ohne Realschule.</w:t>
+      </w:r>
+    </w:p>
+    <w:p>
+      <w:pPr>
+        <w:rPr>
+          <w:b/>
+          <w:bCs/>
+          <w:sz w:val="24"/>
+          <w:szCs w:val="24"/>
+        </w:rPr>
+      </w:pPr>
+      <w:r>
+        <w:rPr>
+          <w:b/>
+          <w:bCs/>
+          <w:sz w:val="24"/>
+          <w:szCs w:val="24"/>
+        </w:rPr>
+        <w:t>19</w:t>
+      </w:r>
+      <w:r>
+        <w:rPr>
+          <w:b/>
+          <w:bCs/>
+          <w:sz w:val="24"/>
+          <w:szCs w:val="24"/>
+        </w:rPr>
+        <w:t>.01.2020</w:t>
+      </w:r>
+    </w:p>
+    <w:p>
+      <w:pPr>
+        <w:rPr>
+          <w:b/>
+          <w:bCs/>
+          <w:sz w:val="24"/>
+          <w:szCs w:val="24"/>
+        </w:rPr>
+      </w:pPr>
+      <w:r>
+        <w:rPr>
+          <w:sz w:val="24"/>
+          <w:szCs w:val="24"/>
+        </w:rPr>
+        <w:t>Im Paket der RS-Zeugnisse wurden die Zeugnisse des Hauptschulbildungsgangs ergänzt.</w:t>
+      </w:r>
+    </w:p>
+    <w:p>
+      <w:pPr>
+        <w:rPr>
+          <w:b/>
+          <w:bCs/>
+          <w:sz w:val="24"/>
+          <w:szCs w:val="24"/>
+        </w:rPr>
+      </w:pPr>
+      <w:r>
+        <w:rPr>
+          <w:b/>
+          <w:bCs/>
+          <w:sz w:val="24"/>
+          <w:szCs w:val="24"/>
+        </w:rPr>
+        <w:t>12</w:t>
+      </w:r>
+      <w:r>
+        <w:rPr>
+          <w:b/>
+          <w:bCs/>
+          <w:sz w:val="24"/>
+          <w:szCs w:val="24"/>
+        </w:rPr>
+        <w:t>.01.2020</w:t>
+      </w:r>
+    </w:p>
+    <w:p>
+      <w:pPr>
+        <w:rPr>
+          <w:b/>
+          <w:bCs/>
+          <w:sz w:val="24"/>
+          <w:szCs w:val="24"/>
+        </w:rPr>
+      </w:pPr>
+      <w:r>
+        <w:rPr>
+          <w:sz w:val="24"/>
+          <w:szCs w:val="24"/>
+        </w:rPr>
+        <w:t>Im Paket HS wurde in Anlage 17 ein Fehler im Script korrigiert.</w:t>
+      </w:r>
+    </w:p>
+    <w:p>
+      <w:pPr>
+        <w:rPr>
+          <w:b/>
+          <w:bCs/>
+          <w:sz w:val="24"/>
+          <w:szCs w:val="24"/>
+        </w:rPr>
+      </w:pPr>
+      <w:r>
+        <w:rPr>
+          <w:b/>
+          <w:bCs/>
+          <w:sz w:val="24"/>
+          <w:szCs w:val="24"/>
+        </w:rPr>
+        <w:t>0</w:t>
+      </w:r>
+      <w:r>
+        <w:rPr>
+          <w:b/>
+          <w:bCs/>
+          <w:sz w:val="24"/>
+          <w:szCs w:val="24"/>
+        </w:rPr>
+        <w:t>7</w:t>
+      </w:r>
+      <w:r>
+        <w:rPr>
+          <w:b/>
+          <w:bCs/>
+          <w:sz w:val="24"/>
+          <w:szCs w:val="24"/>
+        </w:rPr>
+        <w:t>.01.2020</w:t>
+      </w:r>
+    </w:p>
+    <w:p>
+      <w:r>
+        <w:rPr>
+          <w:sz w:val="24"/>
+          <w:szCs w:val="24"/>
+        </w:rPr>
+        <w:t>Alle</w:t>
+      </w:r>
+      <w:r>
+        <w:rPr>
+          <w:sz w:val="24"/>
+          <w:szCs w:val="24"/>
+        </w:rPr>
+        <w:t xml:space="preserve"> Pakete wurden nochmals kontrolliert, weil sich in einigen Abschlusszeugnissen die Option „MitRand“ nicht auf den Druck ausgewirkt hat.</w:t>
+      </w:r>
+    </w:p>
+    <w:p>
+      <w:pPr>
+        <w:rPr>
+          <w:b/>
+          <w:bCs/>
+          <w:sz w:val="24"/>
+          <w:szCs w:val="24"/>
+        </w:rPr>
+      </w:pPr>
+      <w:r>
+        <w:rPr>
+          <w:b/>
+          <w:bCs/>
+          <w:sz w:val="24"/>
+          <w:szCs w:val="24"/>
+        </w:rPr>
+        <w:t>06.01.2020</w:t>
+      </w:r>
+    </w:p>
+    <w:p>
+      <w:pPr>
+        <w:rPr>
+          <w:sz w:val="24"/>
+          <w:szCs w:val="24"/>
+        </w:rPr>
+      </w:pPr>
+      <w:r>
+        <w:rPr>
+          <w:sz w:val="24"/>
+          <w:szCs w:val="24"/>
+        </w:rPr>
+        <w:t>Alle Zeugnispakete der Sek1 wurden auf die kleinen Änderungen in der APO-SI umgestellt. Dies betrifft hauptsächlich die Köpfe des GY-Pakets, wo jetzt G8 und G9 ausgewiesen wird.</w:t>
+      </w:r>
+    </w:p>
+    <w:p>
+      <w:pPr>
+        <w:rPr>
+          <w:sz w:val="24"/>
+          <w:szCs w:val="24"/>
+        </w:rPr>
+      </w:pPr>
+      <w:r>
+        <w:rPr>
+          <w:sz w:val="24"/>
+          <w:szCs w:val="24"/>
+        </w:rPr>
+        <w:t>Dann wurden noch die Fußnoten angepasst, die jetzt mit großem Buchstaben anfangen und mit einem Punkt enden.</w:t>
+      </w:r>
+    </w:p>
+    <w:p>
+      <w:pPr>
+        <w:rPr>
+          <w:sz w:val="24"/>
+          <w:szCs w:val="24"/>
+        </w:rPr>
+      </w:pPr>
+      <w:r>
+        <w:rPr>
+          <w:sz w:val="24"/>
+          <w:szCs w:val="24"/>
+        </w:rPr>
         <w:lastRenderedPageBreak/>
-        <w:t>Es kann nun über die INI-Datei eingestellt werden, ab das Feld Vorname, die Felder Vorname + Zusatz oder nur das Feld Zusatz (Alle Vornamen) ausgewertet wird.</w:t>
-      </w:r>
-    </w:p>
-    <w:p>
-      <w:pPr>
-        <w:rPr>
-          <w:sz w:val="24"/>
-          <w:szCs w:val="24"/>
-        </w:rPr>
-      </w:pPr>
-      <w:r>
-        <w:rPr>
-          <w:sz w:val="24"/>
-          <w:szCs w:val="24"/>
-        </w:rPr>
-        <w:t>Alle Änderungen sind im PDF Hinweise zur Nutzung beschrieben.</w:t>
-      </w:r>
-    </w:p>
-    <w:p>
-      <w:pPr>
-        <w:rPr>
-          <w:b/>
-          <w:bCs/>
-          <w:sz w:val="24"/>
-          <w:szCs w:val="24"/>
-        </w:rPr>
-      </w:pPr>
-    </w:p>
-    <w:p>
-      <w:pPr>
-        <w:rPr>
-          <w:b/>
-          <w:bCs/>
-          <w:sz w:val="24"/>
-          <w:szCs w:val="24"/>
-        </w:rPr>
-      </w:pPr>
-      <w:r>
-        <w:rPr>
-          <w:b/>
-          <w:bCs/>
-          <w:sz w:val="24"/>
-          <w:szCs w:val="24"/>
-        </w:rPr>
-        <w:t>31</w:t>
-      </w:r>
-      <w:r>
-        <w:rPr>
-          <w:b/>
-          <w:bCs/>
-          <w:sz w:val="24"/>
-          <w:szCs w:val="24"/>
-        </w:rPr>
-        <w:t>.01.2020</w:t>
-      </w:r>
-    </w:p>
-    <w:p>
-      <w:r>
-        <w:rPr>
-          <w:sz w:val="24"/>
-          <w:szCs w:val="24"/>
-        </w:rPr>
-        <w:t>Im Paket der RS wurde im Überweisungszeugnis die Ausgabe der Schulform im Kopf korrigiert.</w:t>
-      </w:r>
-    </w:p>
-    <w:p>
-      <w:pPr>
-        <w:rPr>
-          <w:b/>
-          <w:bCs/>
-          <w:sz w:val="24"/>
-          <w:szCs w:val="24"/>
-        </w:rPr>
-      </w:pPr>
-      <w:r>
-        <w:rPr>
-          <w:b/>
-          <w:bCs/>
-          <w:sz w:val="24"/>
-          <w:szCs w:val="24"/>
-        </w:rPr>
-        <w:t>29</w:t>
-      </w:r>
-      <w:r>
-        <w:rPr>
-          <w:b/>
-          <w:bCs/>
-          <w:sz w:val="24"/>
-          <w:szCs w:val="24"/>
-        </w:rPr>
-        <w:t>.01.2020</w:t>
-      </w:r>
-    </w:p>
-    <w:p>
-      <w:r>
-        <w:rPr>
-          <w:sz w:val="24"/>
-          <w:szCs w:val="24"/>
-        </w:rPr>
-        <w:t>Im Paket SK wurde in Anlage 46 ein Fehler bei der Anzeige der Elternsprechtage behoben.</w:t>
-      </w:r>
-    </w:p>
-    <w:p>
-      <w:pPr>
-        <w:rPr>
-          <w:b/>
-          <w:bCs/>
-          <w:sz w:val="24"/>
-          <w:szCs w:val="24"/>
-        </w:rPr>
-      </w:pPr>
-      <w:r>
-        <w:rPr>
-          <w:b/>
-          <w:bCs/>
-          <w:sz w:val="24"/>
-          <w:szCs w:val="24"/>
-        </w:rPr>
-        <w:t>20</w:t>
-      </w:r>
-      <w:r>
-        <w:rPr>
-          <w:b/>
-          <w:bCs/>
-          <w:sz w:val="24"/>
-          <w:szCs w:val="24"/>
-        </w:rPr>
-        <w:t>.01.2020</w:t>
-      </w:r>
-    </w:p>
-    <w:p>
-      <w:pPr>
-        <w:rPr>
-          <w:b/>
-          <w:bCs/>
-          <w:sz w:val="24"/>
-          <w:szCs w:val="24"/>
-        </w:rPr>
-      </w:pPr>
-      <w:r>
-        <w:rPr>
-          <w:sz w:val="24"/>
-          <w:szCs w:val="24"/>
-        </w:rPr>
-        <w:t>Im Paket RS Bildungsgang HS wurde ein Tippfehler „Realschuele“ in den Hinweisen zum Zeugnis korrigiert.</w:t>
-      </w:r>
-      <w:r>
-        <w:rPr>
-          <w:sz w:val="24"/>
-          <w:szCs w:val="24"/>
-        </w:rPr>
-        <w:t xml:space="preserve"> Außerdem wurde ein überflüssiges „der“ in der Formulierung zum Förderschwerpunkt entfernt.</w:t>
-      </w:r>
-    </w:p>
-    <w:p>
-      <w:pPr>
-        <w:rPr>
-          <w:b/>
-          <w:bCs/>
-          <w:sz w:val="24"/>
-          <w:szCs w:val="24"/>
-        </w:rPr>
-      </w:pPr>
-      <w:r>
-        <w:rPr>
-          <w:b/>
-          <w:bCs/>
-          <w:sz w:val="24"/>
-          <w:szCs w:val="24"/>
-        </w:rPr>
-        <w:t>20</w:t>
-      </w:r>
-      <w:r>
-        <w:rPr>
-          <w:b/>
-          <w:bCs/>
-          <w:sz w:val="24"/>
-          <w:szCs w:val="24"/>
-        </w:rPr>
-        <w:t>.01.2020</w:t>
-      </w:r>
-    </w:p>
-    <w:p>
-      <w:pPr>
-        <w:rPr>
-          <w:b/>
-          <w:bCs/>
-          <w:sz w:val="24"/>
-          <w:szCs w:val="24"/>
-        </w:rPr>
-      </w:pPr>
-      <w:r>
-        <w:rPr>
-          <w:sz w:val="24"/>
-          <w:szCs w:val="24"/>
-        </w:rPr>
-        <w:t>Im Paket der RS-Zeugnisse wurde ein Fehler bei der Ausgabe des Förderschwerpunkts behoben, es erschien nur „im Bildungsgang“ ohne Realschule.</w:t>
-      </w:r>
-    </w:p>
-    <w:p>
-      <w:pPr>
-        <w:rPr>
-          <w:b/>
-          <w:bCs/>
-          <w:sz w:val="24"/>
-          <w:szCs w:val="24"/>
-        </w:rPr>
-      </w:pPr>
-      <w:r>
-        <w:rPr>
-          <w:b/>
-          <w:bCs/>
-          <w:sz w:val="24"/>
-          <w:szCs w:val="24"/>
-        </w:rPr>
-        <w:t>19</w:t>
-      </w:r>
-      <w:r>
-        <w:rPr>
-          <w:b/>
-          <w:bCs/>
-          <w:sz w:val="24"/>
-          <w:szCs w:val="24"/>
-        </w:rPr>
-        <w:t>.01.2020</w:t>
-      </w:r>
-    </w:p>
-    <w:p>
-      <w:pPr>
-        <w:rPr>
-          <w:b/>
-          <w:bCs/>
-          <w:sz w:val="24"/>
-          <w:szCs w:val="24"/>
-        </w:rPr>
-      </w:pPr>
-      <w:r>
-        <w:rPr>
-          <w:sz w:val="24"/>
-          <w:szCs w:val="24"/>
-        </w:rPr>
-        <w:t>Im Paket der RS-Zeugnisse wurden die Zeugnisse des Hauptschulbildungsgangs ergänzt.</w:t>
-      </w:r>
-    </w:p>
-    <w:p>
-      <w:pPr>
-        <w:rPr>
-          <w:b/>
-          <w:bCs/>
-          <w:sz w:val="24"/>
-          <w:szCs w:val="24"/>
-        </w:rPr>
-      </w:pPr>
-      <w:r>
-        <w:rPr>
-          <w:b/>
-          <w:bCs/>
-          <w:sz w:val="24"/>
-          <w:szCs w:val="24"/>
-        </w:rPr>
-        <w:t>12</w:t>
-      </w:r>
-      <w:r>
-        <w:rPr>
-          <w:b/>
-          <w:bCs/>
-          <w:sz w:val="24"/>
-          <w:szCs w:val="24"/>
-        </w:rPr>
-        <w:t>.01.2020</w:t>
-      </w:r>
-    </w:p>
-    <w:p>
-      <w:pPr>
-        <w:rPr>
-          <w:b/>
-          <w:bCs/>
-          <w:sz w:val="24"/>
-          <w:szCs w:val="24"/>
-        </w:rPr>
-      </w:pPr>
-      <w:r>
-        <w:rPr>
-          <w:sz w:val="24"/>
-          <w:szCs w:val="24"/>
-        </w:rPr>
-        <w:t>Im Paket HS wurde in Anlage 17 ein Fehler im Script korrigiert.</w:t>
-      </w:r>
-    </w:p>
-    <w:p>
-      <w:pPr>
-        <w:rPr>
-          <w:b/>
-          <w:bCs/>
-          <w:sz w:val="24"/>
-          <w:szCs w:val="24"/>
-        </w:rPr>
-      </w:pPr>
-      <w:r>
-        <w:rPr>
-          <w:b/>
-          <w:bCs/>
-          <w:sz w:val="24"/>
-          <w:szCs w:val="24"/>
-        </w:rPr>
-        <w:t>0</w:t>
-      </w:r>
-      <w:r>
-        <w:rPr>
-          <w:b/>
-          <w:bCs/>
-          <w:sz w:val="24"/>
-          <w:szCs w:val="24"/>
-        </w:rPr>
-        <w:t>7</w:t>
-      </w:r>
-      <w:r>
-        <w:rPr>
-          <w:b/>
-          <w:bCs/>
-          <w:sz w:val="24"/>
-          <w:szCs w:val="24"/>
-        </w:rPr>
-        <w:t>.01.2020</w:t>
-      </w:r>
-    </w:p>
-    <w:p>
-      <w:r>
-        <w:rPr>
-          <w:sz w:val="24"/>
-          <w:szCs w:val="24"/>
-        </w:rPr>
-        <w:t>Alle</w:t>
-      </w:r>
-      <w:r>
-        <w:rPr>
-          <w:sz w:val="24"/>
-          <w:szCs w:val="24"/>
-        </w:rPr>
-        <w:t xml:space="preserve"> Pakete wurden nochmals kontrolliert, weil sich in einigen Abschlusszeugnissen die Option „MitRand“ nicht auf den Druck ausgewirkt hat.</w:t>
-      </w:r>
-    </w:p>
-    <w:p>
-      <w:pPr>
-        <w:rPr>
-          <w:b/>
-          <w:bCs/>
-          <w:sz w:val="24"/>
-          <w:szCs w:val="24"/>
-        </w:rPr>
-      </w:pPr>
-      <w:r>
-        <w:rPr>
-          <w:b/>
-          <w:bCs/>
-          <w:sz w:val="24"/>
-          <w:szCs w:val="24"/>
-        </w:rPr>
-        <w:t>06.01.2020</w:t>
-      </w:r>
-    </w:p>
-    <w:p>
-      <w:pPr>
-        <w:rPr>
-          <w:sz w:val="24"/>
-          <w:szCs w:val="24"/>
-        </w:rPr>
-      </w:pPr>
-      <w:r>
-        <w:rPr>
-          <w:sz w:val="24"/>
-          <w:szCs w:val="24"/>
-        </w:rPr>
-        <w:t>Alle Zeugnispakete der Sek1 wurden auf die kleinen Änderungen in der APO-SI umgestellt. Dies betrifft hauptsächlich die Köpfe des GY-Pakets, wo jetzt G8 und G9 ausgewiesen wird.</w:t>
-      </w:r>
-    </w:p>
-    <w:p>
-      <w:pPr>
-        <w:rPr>
-          <w:sz w:val="24"/>
-          <w:szCs w:val="24"/>
-        </w:rPr>
-      </w:pPr>
-      <w:r>
-        <w:rPr>
-          <w:sz w:val="24"/>
-          <w:szCs w:val="24"/>
-        </w:rPr>
-        <w:t>Dann wurden noch die Fußnoten angepasst, die jetzt mit großem Buchstaben anfangen und mit einem Punkt enden.</w:t>
-      </w:r>
-    </w:p>
-    <w:p>
-      <w:pPr>
-        <w:rPr>
-          <w:sz w:val="24"/>
-          <w:szCs w:val="24"/>
-        </w:rPr>
-      </w:pPr>
-      <w:r>
-        <w:rPr>
-          <w:sz w:val="24"/>
-          <w:szCs w:val="24"/>
-        </w:rPr>
         <w:t>Am Layout wurden einige Unschönheiten korrigiert, die Pakete stehen ab sofort nur noch in der Schriftart Calibri zur Verfügung.</w:t>
       </w:r>
     </w:p>
@@ -4466,7 +4539,6 @@
           <w:sz w:val="24"/>
           <w:szCs w:val="24"/>
         </w:rPr>
-        <w:lastRenderedPageBreak/>
         <w:t>Bitte lesen Sie die Hinweise nur Nutzung der INI-Dateien.</w:t>
       </w:r>
       <w:r>
@@ -5493,6 +5565,119 @@
     </w:lvl>
   </w:abstractNum>
   <w:abstractNum w:abstractNumId="9" w15:restartNumberingAfterBreak="0">
+    <w:nsid w:val="2AE5500B"/>
+    <w:multiLevelType w:val="hybridMultilevel"/>
+    <w:tmpl w:val="FDB48CAE"/>
+    <w:lvl w:ilvl="0" w:tplc="04070001">
+      <w:start w:val="1"/>
+      <w:numFmt w:val="bullet"/>
+      <w:lvlText w:val=""/>
+      <w:lvlJc w:val="left"/>
+      <w:pPr>
+        <w:ind w:left="720" w:hanging="360"/>
+      </w:pPr>
+      <w:rPr>
+        <w:rFonts w:ascii="Symbol" w:hAnsi="Symbol" w:hint="default"/>
+      </w:rPr>
+    </w:lvl>
+    <w:lvl w:ilvl="1" w:tplc="04070003" w:tentative="1">
+      <w:start w:val="1"/>
+      <w:numFmt w:val="bullet"/>
+      <w:lvlText w:val="o"/>
+      <w:lvlJc w:val="left"/>
+      <w:pPr>
+        <w:ind w:left="1440" w:hanging="360"/>
+      </w:pPr>
+      <w:rPr>
+        <w:rFonts w:ascii="Courier New" w:hAnsi="Courier New" w:cs="Courier New" w:hint="default"/>
+      </w:rPr>
+    </w:lvl>
+    <w:lvl w:ilvl="2" w:tplc="04070005" w:tentative="1">
+      <w:start w:val="1"/>
+      <w:numFmt w:val="bullet"/>
+      <w:lvlText w:val=""/>
+      <w:lvlJc w:val="left"/>
+      <w:pPr>
+        <w:ind w:left="2160" w:hanging="360"/>
+      </w:pPr>
+      <w:rPr>
+        <w:rFonts w:ascii="Wingdings" w:hAnsi="Wingdings" w:hint="default"/>
+      </w:rPr>
+    </w:lvl>
+    <w:lvl w:ilvl="3" w:tplc="04070001" w:tentative="1">
+      <w:start w:val="1"/>
+      <w:numFmt w:val="bullet"/>
+      <w:lvlText w:val=""/>
+      <w:lvlJc w:val="left"/>
+      <w:pPr>
+        <w:ind w:left="2880" w:hanging="360"/>
+      </w:pPr>
+      <w:rPr>
+        <w:rFonts w:ascii="Symbol" w:hAnsi="Symbol" w:hint="default"/>
+      </w:rPr>
+    </w:lvl>
+    <w:lvl w:ilvl="4" w:tplc="04070003" w:tentative="1">
+      <w:start w:val="1"/>
+      <w:numFmt w:val="bullet"/>
+      <w:lvlText w:val="o"/>
+      <w:lvlJc w:val="left"/>
+      <w:pPr>
+        <w:ind w:left="3600" w:hanging="360"/>
+      </w:pPr>
+      <w:rPr>
+        <w:rFonts w:ascii="Courier New" w:hAnsi="Courier New" w:cs="Courier New" w:hint="default"/>
+      </w:rPr>
+    </w:lvl>
+    <w:lvl w:ilvl="5" w:tplc="04070005" w:tentative="1">
+      <w:start w:val="1"/>
+      <w:numFmt w:val="bullet"/>
+      <w:lvlText w:val=""/>
+      <w:lvlJc w:val="left"/>
+      <w:pPr>
+        <w:ind w:left="4320" w:hanging="360"/>
+      </w:pPr>
+      <w:rPr>
+        <w:rFonts w:ascii="Wingdings" w:hAnsi="Wingdings" w:hint="default"/>
+      </w:rPr>
+    </w:lvl>
+    <w:lvl w:ilvl="6" w:tplc="04070001" w:tentative="1">
+      <w:start w:val="1"/>
+      <w:numFmt w:val="bullet"/>
+      <w:lvlText w:val=""/>
+      <w:lvlJc w:val="left"/>
+      <w:pPr>
+        <w:ind w:left="5040" w:hanging="360"/>
+      </w:pPr>
+      <w:rPr>
+        <w:rFonts w:ascii="Symbol" w:hAnsi="Symbol" w:hint="default"/>
+      </w:rPr>
+    </w:lvl>
+    <w:lvl w:ilvl="7" w:tplc="04070003" w:tentative="1">
+      <w:start w:val="1"/>
+      <w:numFmt w:val="bullet"/>
+      <w:lvlText w:val="o"/>
+      <w:lvlJc w:val="left"/>
+      <w:pPr>
+        <w:ind w:left="5760" w:hanging="360"/>
+      </w:pPr>
+      <w:rPr>
+        <w:rFonts w:ascii="Courier New" w:hAnsi="Courier New" w:cs="Courier New" w:hint="default"/>
+      </w:rPr>
+    </w:lvl>
+    <w:lvl w:ilvl="8" w:tplc="04070005" w:tentative="1">
+      <w:start w:val="1"/>
+      <w:numFmt w:val="bullet"/>
+      <w:lvlText w:val=""/>
+      <w:lvlJc w:val="left"/>
+      <w:pPr>
+        <w:ind w:left="6480" w:hanging="360"/>
+      </w:pPr>
+      <w:rPr>
+        <w:rFonts w:ascii="Wingdings" w:hAnsi="Wingdings" w:hint="default"/>
+      </w:rPr>
+    </w:lvl>
+  </w:abstractNum>
+  <w:abstractNum w:abstractNumId="10" w15:restartNumberingAfterBreak="0">
     <w:nsid w:val="36C55F54"/>
     <w:multiLevelType w:val="hybridMultilevel"/>
     <w:tmpl w:val="AF7EE7E0"/>
@@ -5605,7 +5790,7 @@
       </w:rPr>
     </w:lvl>
   </w:abstractNum>
-  <w:abstractNum w:abstractNumId="10" w15:restartNumberingAfterBreak="0">
+  <w:abstractNum w:abstractNumId="11" w15:restartNumberingAfterBreak="0">
     <w:nsid w:val="3E306AB6"/>
     <w:multiLevelType w:val="multilevel"/>
     <w:tmpl w:val="0B68FDAC"/>
@@ -5754,7 +5939,7 @@
       </w:rPr>
     </w:lvl>
   </w:abstractNum>
-  <w:abstractNum w:abstractNumId="11" w15:restartNumberingAfterBreak="0">
+  <w:abstractNum w:abstractNumId="12" w15:restartNumberingAfterBreak="0">
     <w:nsid w:val="445B1EDF"/>
     <w:multiLevelType w:val="hybridMultilevel"/>
     <w:tmpl w:val="F9F02C22"/>
@@ -5867,7 +6052,7 @@
       </w:rPr>
     </w:lvl>
   </w:abstractNum>
-  <w:abstractNum w:abstractNumId="12" w15:restartNumberingAfterBreak="0">
+  <w:abstractNum w:abstractNumId="13" w15:restartNumberingAfterBreak="0">
     <w:nsid w:val="50115371"/>
     <w:multiLevelType w:val="hybridMultilevel"/>
     <w:tmpl w:val="DAB4D778"/>
@@ -5980,7 +6165,7 @@
       </w:rPr>
     </w:lvl>
   </w:abstractNum>
-  <w:abstractNum w:abstractNumId="13" w15:restartNumberingAfterBreak="0">
+  <w:abstractNum w:abstractNumId="14" w15:restartNumberingAfterBreak="0">
     <w:nsid w:val="570B7EF1"/>
     <w:multiLevelType w:val="hybridMultilevel"/>
     <w:tmpl w:val="9264AAF0"/>
@@ -6093,7 +6278,7 @@
       </w:rPr>
     </w:lvl>
   </w:abstractNum>
-  <w:abstractNum w:abstractNumId="14" w15:restartNumberingAfterBreak="0">
+  <w:abstractNum w:abstractNumId="15" w15:restartNumberingAfterBreak="0">
     <w:nsid w:val="596E2557"/>
     <w:multiLevelType w:val="hybridMultilevel"/>
     <w:tmpl w:val="700031B2"/>
@@ -6206,7 +6391,7 @@
       </w:rPr>
     </w:lvl>
   </w:abstractNum>
-  <w:abstractNum w:abstractNumId="15" w15:restartNumberingAfterBreak="0">
+  <w:abstractNum w:abstractNumId="16" w15:restartNumberingAfterBreak="0">
     <w:nsid w:val="5FD53C4D"/>
     <w:multiLevelType w:val="hybridMultilevel"/>
     <w:tmpl w:val="0CE05460"/>
@@ -6319,7 +6504,7 @@
       </w:rPr>
     </w:lvl>
   </w:abstractNum>
-  <w:abstractNum w:abstractNumId="16" w15:restartNumberingAfterBreak="0">
+  <w:abstractNum w:abstractNumId="17" w15:restartNumberingAfterBreak="0">
     <w:nsid w:val="64155727"/>
     <w:multiLevelType w:val="hybridMultilevel"/>
     <w:tmpl w:val="87BE01FC"/>
@@ -6432,7 +6617,7 @@
       </w:rPr>
     </w:lvl>
   </w:abstractNum>
-  <w:abstractNum w:abstractNumId="17" w15:restartNumberingAfterBreak="0">
+  <w:abstractNum w:abstractNumId="18" w15:restartNumberingAfterBreak="0">
     <w:nsid w:val="6418279D"/>
     <w:multiLevelType w:val="hybridMultilevel"/>
     <w:tmpl w:val="BB92601A"/>
@@ -6545,7 +6730,7 @@
       </w:rPr>
     </w:lvl>
   </w:abstractNum>
-  <w:abstractNum w:abstractNumId="18" w15:restartNumberingAfterBreak="0">
+  <w:abstractNum w:abstractNumId="19" w15:restartNumberingAfterBreak="0">
     <w:nsid w:val="653A2FD7"/>
     <w:multiLevelType w:val="hybridMultilevel"/>
     <w:tmpl w:val="2DB86308"/>
@@ -6658,7 +6843,7 @@
       </w:rPr>
     </w:lvl>
   </w:abstractNum>
-  <w:abstractNum w:abstractNumId="19" w15:restartNumberingAfterBreak="0">
+  <w:abstractNum w:abstractNumId="20" w15:restartNumberingAfterBreak="0">
     <w:nsid w:val="69A06940"/>
     <w:multiLevelType w:val="hybridMultilevel"/>
     <w:tmpl w:val="F9027BBC"/>
@@ -6771,7 +6956,7 @@
       </w:rPr>
     </w:lvl>
   </w:abstractNum>
-  <w:abstractNum w:abstractNumId="20" w15:restartNumberingAfterBreak="0">
+  <w:abstractNum w:abstractNumId="21" w15:restartNumberingAfterBreak="0">
     <w:nsid w:val="6F9E5100"/>
     <w:multiLevelType w:val="hybridMultilevel"/>
     <w:tmpl w:val="9B9AEBE6"/>
@@ -6884,7 +7069,7 @@
       </w:rPr>
     </w:lvl>
   </w:abstractNum>
-  <w:abstractNum w:abstractNumId="21" w15:restartNumberingAfterBreak="0">
+  <w:abstractNum w:abstractNumId="22" w15:restartNumberingAfterBreak="0">
     <w:nsid w:val="721D04BA"/>
     <w:multiLevelType w:val="hybridMultilevel"/>
     <w:tmpl w:val="02F270C4"/>
@@ -6997,7 +7182,7 @@
       </w:rPr>
     </w:lvl>
   </w:abstractNum>
-  <w:abstractNum w:abstractNumId="22" w15:restartNumberingAfterBreak="0">
+  <w:abstractNum w:abstractNumId="23" w15:restartNumberingAfterBreak="0">
     <w:nsid w:val="7EF71364"/>
     <w:multiLevelType w:val="hybridMultilevel"/>
     <w:tmpl w:val="2F60FA80"/>
@@ -7110,7 +7295,7 @@
       </w:rPr>
     </w:lvl>
   </w:abstractNum>
-  <w:abstractNum w:abstractNumId="23" w15:restartNumberingAfterBreak="0">
+  <w:abstractNum w:abstractNumId="24" w15:restartNumberingAfterBreak="0">
     <w:nsid w:val="7FDC6D69"/>
     <w:multiLevelType w:val="hybridMultilevel"/>
     <w:tmpl w:val="6B7296A4"/>
@@ -7227,34 +7412,34 @@
     <w:abstractNumId w:val="8"/>
   </w:num>
   <w:num w:numId="2" w16cid:durableId="1199199039">
-    <w:abstractNumId w:val="10"/>
+    <w:abstractNumId w:val="11"/>
   </w:num>
   <w:num w:numId="3" w16cid:durableId="249388554">
-    <w:abstractNumId w:val="18"/>
+    <w:abstractNumId w:val="19"/>
   </w:num>
   <w:num w:numId="4" w16cid:durableId="717431757">
-    <w:abstractNumId w:val="9"/>
+    <w:abstractNumId w:val="10"/>
   </w:num>
   <w:num w:numId="5" w16cid:durableId="2134857097">
     <w:abstractNumId w:val="7"/>
   </w:num>
   <w:num w:numId="6" w16cid:durableId="486243361">
-    <w:abstractNumId w:val="13"/>
+    <w:abstractNumId w:val="14"/>
   </w:num>
   <w:num w:numId="7" w16cid:durableId="426195627">
-    <w:abstractNumId w:val="19"/>
+    <w:abstractNumId w:val="20"/>
   </w:num>
   <w:num w:numId="8" w16cid:durableId="2052876785">
     <w:abstractNumId w:val="5"/>
   </w:num>
   <w:num w:numId="9" w16cid:durableId="895749252">
-    <w:abstractNumId w:val="12"/>
+    <w:abstractNumId w:val="13"/>
   </w:num>
   <w:num w:numId="10" w16cid:durableId="1574973628">
-    <w:abstractNumId w:val="16"/>
+    <w:abstractNumId w:val="17"/>
   </w:num>
   <w:num w:numId="11" w16cid:durableId="1243294514">
-    <w:abstractNumId w:val="14"/>
+    <w:abstractNumId w:val="15"/>
   </w:num>
   <w:num w:numId="12" w16cid:durableId="1592468375">
     <w:abstractNumId w:val="4"/>
@@ -7269,7 +7454,7 @@
     <w:abstractNumId w:val="6"/>
   </w:num>
   <w:num w:numId="16" w16cid:durableId="745879591">
-    <w:abstractNumId w:val="21"/>
+    <w:abstractNumId w:val="22"/>
   </w:num>
   <w:num w:numId="17" w16cid:durableId="1494182071">
     <w:abstractNumId w:val="3"/>
@@ -7278,22 +7463,25 @@
     <w:abstractNumId w:val="0"/>
   </w:num>
   <w:num w:numId="19" w16cid:durableId="2016491355">
-    <w:abstractNumId w:val="20"/>
+    <w:abstractNumId w:val="21"/>
   </w:num>
   <w:num w:numId="20" w16cid:durableId="834614168">
+    <w:abstractNumId w:val="24"/>
+  </w:num>
+  <w:num w:numId="21" w16cid:durableId="1669794055">
     <w:abstractNumId w:val="23"/>
   </w:num>
-  <w:num w:numId="21" w16cid:durableId="1669794055">
-    <w:abstractNumId w:val="22"/>
-  </w:num>
   <w:num w:numId="22" w16cid:durableId="625937407">
-    <w:abstractNumId w:val="17"/>
+    <w:abstractNumId w:val="18"/>
   </w:num>
   <w:num w:numId="23" w16cid:durableId="904027768">
-    <w:abstractNumId w:val="15"/>
+    <w:abstractNumId w:val="16"/>
   </w:num>
   <w:num w:numId="24" w16cid:durableId="1593782573">
-    <w:abstractNumId w:val="11"/>
+    <w:abstractNumId w:val="12"/>
+  </w:num>
+  <w:num w:numId="25" w16cid:durableId="396783290">
+    <w:abstractNumId w:val="9"/>
   </w:num>
 </w:numbering>
 </file>

</xml_diff>